<commit_message>
Source Westerplatte speech and drone factory fire in Poland article
Co-Authored-By: Claude Opus 5.5 <noreply@anthropic.com>
Claude-Session: https://claude.ai/code/session_017gyzaahrrXayinQ2De8TWf
</commit_message>
<xml_diff>
--- a/polonia_estructura.docx
+++ b/polonia_estructura.docx
@@ -124,7 +124,7 @@
         <w:spacing w:after="200" w:line="300"/>
       </w:pPr>
       <w:r>
-        <w:t xml:space="preserve">La acusación pesa más en una campaña que gira en torno a Rusia. La carrera arrancó extraoficialmente el 1 de septiembre en Westerplatte, donde empezó en 1939 la Segunda Guerra Mundial. Tusk advirtió allí de que el otoño y el invierno pueden ser decisivos para Ucrania y Polonia: «No hay una Polonia segura sin una Ucrania segura». En agosto se incendió una fábrica de componentes de drones cerca de Varsovia, y se investiga si fue un sabotaje [FUENTE?]. El proyecto de presupuesto para 2027 destina a Defensa 198.100 millones de zlotys, el 4,5 % del PIB, según Reuters.</w:t>
+        <w:t xml:space="preserve">La acusación pesa más en una campaña que gira en torno a Rusia. La carrera arrancó extraoficialmente el 1 de septiembre en Westerplatte, donde empezó en 1939 la Segunda Guerra Mundial. Allí Tusk advirtió de que «este otoño y este invierno pueden ser clave no solo para la independencia de Ucrania, sino también para la seguridad de Polonia y de todo el mundo libre», recoge la televisión Polsat News. «El destino de Ucrania es también nuestro destino», añadió. Un día antes, un incendio había destruido almacenes de WB Electronics, el mayor fabricante privado de drones del país, en Skarżysko-Kamienna, y los servicios de inteligencia investigan si fue un sabotaje, informa Bloomberg. El proyecto de presupuesto para 2027 destina a Defensa 198.100 millones de zlotys, el 4,5 % del PIB, según Reuters.</w:t>
       </w:r>
     </w:p>
     <w:p>
@@ -568,7 +568,7 @@
         <w:t xml:space="preserve">[FUENTE?]</w:t>
       </w:r>
       <w:r>
-        <w:t xml:space="preserve">: primera entrevista de Waluś, «ídolo de la ultraderecha», Hermeliński, Dudek, el incendio de la fábrica de drones y el veto a las ayudas.</w:t>
+        <w:t xml:space="preserve">: primera entrevista de Waluś, «ídolo de la ultraderecha», Hermeliński, Dudek, y el veto a las ayudas.</w:t>
       </w:r>
     </w:p>
     <w:sectPr>

</xml_diff>